<commit_message>
updating details in self-check
</commit_message>
<xml_diff>
--- a/TechComm/assignments/informational-report/info-report-self-check/info-report-self-check-AIprompt.docx
+++ b/TechComm/assignments/informational-report/info-report-self-check/info-report-self-check-AIprompt.docx
@@ -210,7 +210,19 @@
         <w:rPr>
           <w:rFonts w:ascii="Verdana" w:hAnsi="Verdana"/>
         </w:rPr>
-        <w:t xml:space="preserve"> that includes a return address and date, an inside address, a subject line, a salutation, a body of two to three paragraphs, a closing paragraph with contact information, and a closing with a signature block. It includes an enclosure notation that names the informational report. </w:t>
+        <w:t xml:space="preserve"> that includes a return address and date, an inside address, a subject line, a salutation, a body of </w:t>
+      </w:r>
+      <w:r>
+        <w:rPr>
+          <w:rFonts w:ascii="Verdana" w:hAnsi="Verdana"/>
+        </w:rPr>
+        <w:t xml:space="preserve">four </w:t>
+      </w:r>
+      <w:r>
+        <w:rPr>
+          <w:rFonts w:ascii="Verdana" w:hAnsi="Verdana"/>
+        </w:rPr>
+        <w:t xml:space="preserve">paragraphs, a closing paragraph with contact information, and a closing with a signature block. It includes an enclosure notation that names the informational report. </w:t>
       </w:r>
       <w:r>
         <w:rPr>

</xml_diff>